<commit_message>
Finalize portfolio: overview figure, README header, planning-doc status
- Add docs/images/sentinel_swarm_overview.png rendered from the real
  coordination algorithms (Phase 4 coverage + Phase 5 quarantine) and embed
  it at the top of the README
- Add an implementation-status + ROS 2 Humble verification section (Section 11)
  to the development plan (.docx)

Co-Authored-By: Claude Opus 4.8 <noreply@anthropic.com>
</commit_message>
<xml_diff>
--- a/docs/SENTINEL_SWARM_DEVELOPMENT_PLAN.docx
+++ b/docs/SENTINEL_SWARM_DEVELOPMENT_PLAN.docx
@@ -261,6 +261,17 @@
           <w:sz w:val="22"/>
         </w:rPr>
         <w:t>10. 공고 요구사항 매핑표 및 면접 차별 포인트</w:t>
+      </w:r>
+    </w:p>
+    <w:p>
+      <w:pPr>
+        <w:spacing w:after="80"/>
+      </w:pPr>
+      <w:r>
+        <w:rPr>
+          <w:sz w:val="22"/>
+        </w:rPr>
+        <w:t>11. 구현 현황 및 실연동 검증</w:t>
       </w:r>
     </w:p>
     <w:p>
@@ -4586,6 +4597,558 @@
         <w:t>결론: 일반 지원자가 채우지 못하는 "보안·안전 표준 + 실시간 SW + 자율비행 군집"의 교집합을 하나의 동작하는 시스템으로 증명하는 것이 본 기획의 목표다.</w:t>
       </w:r>
     </w:p>
+    <w:p>
+      <w:r>
+        <w:br w:type="page"/>
+      </w:r>
+    </w:p>
+    <w:p>
+      <w:pPr>
+        <w:spacing w:after="160" w:before="0"/>
+      </w:pPr>
+      <w:r>
+        <w:rPr>
+          <w:b/>
+          <w:i w:val="0"/>
+          <w:color w:val="1F4E79"/>
+          <w:sz w:val="30"/>
+        </w:rPr>
+        <w:t>11. 구현 현황 및 실연동 검증</w:t>
+      </w:r>
+    </w:p>
+    <w:p>
+      <w:pPr>
+        <w:spacing w:after="120" w:before="0"/>
+      </w:pPr>
+      <w:r>
+        <w:rPr>
+          <w:b w:val="0"/>
+          <w:i w:val="0"/>
+          <w:sz w:val="21"/>
+        </w:rPr>
+        <w:t>기획서 작성 이후 5단계 전체를 코드로 구현하고, 기존 SDV 플랫폼을 드론 군집으로 진화시켰다. 단계별 현황은 다음과 같다.</w:t>
+      </w:r>
+    </w:p>
+    <w:tbl>
+      <w:tblPr>
+        <w:tblStyle w:val="LightGrid-Accent1"/>
+        <w:tblW w:type="auto" w:w="0"/>
+        <w:jc w:val="center"/>
+        <w:tblLook w:firstColumn="1" w:firstRow="1" w:lastColumn="0" w:lastRow="0" w:noHBand="0" w:noVBand="1" w:val="04A0"/>
+      </w:tblPr>
+      <w:tblGrid>
+        <w:gridCol w:w="2880"/>
+        <w:gridCol w:w="2880"/>
+        <w:gridCol w:w="2880"/>
+      </w:tblGrid>
+      <w:tr>
+        <w:tc>
+          <w:tcPr>
+            <w:tcW w:type="dxa" w:w="2592"/>
+            <w:shd w:val="clear" w:color="auto" w:fill="1F4E79"/>
+          </w:tcPr>
+          <w:p>
+            <w:r/>
+            <w:r>
+              <w:rPr>
+                <w:b/>
+                <w:color w:val="FFFFFF"/>
+                <w:sz w:val="18"/>
+              </w:rPr>
+              <w:t>단계</w:t>
+            </w:r>
+          </w:p>
+        </w:tc>
+        <w:tc>
+          <w:tcPr>
+            <w:tcW w:type="dxa" w:w="4320"/>
+            <w:shd w:val="clear" w:color="auto" w:fill="1F4E79"/>
+          </w:tcPr>
+          <w:p>
+            <w:r/>
+            <w:r>
+              <w:rPr>
+                <w:b/>
+                <w:color w:val="FFFFFF"/>
+                <w:sz w:val="18"/>
+              </w:rPr>
+              <w:t>구현 패키지</w:t>
+            </w:r>
+          </w:p>
+        </w:tc>
+        <w:tc>
+          <w:tcPr>
+            <w:tcW w:type="dxa" w:w="2448"/>
+            <w:shd w:val="clear" w:color="auto" w:fill="1F4E79"/>
+          </w:tcPr>
+          <w:p>
+            <w:r/>
+            <w:r>
+              <w:rPr>
+                <w:b/>
+                <w:color w:val="FFFFFF"/>
+                <w:sz w:val="18"/>
+              </w:rPr>
+              <w:t>상태</w:t>
+            </w:r>
+          </w:p>
+        </w:tc>
+      </w:tr>
+      <w:tr>
+        <w:tc>
+          <w:tcPr>
+            <w:tcW w:type="dxa" w:w="2592"/>
+          </w:tcPr>
+          <w:p>
+            <w:r/>
+            <w:r>
+              <w:rPr>
+                <w:sz w:val="18"/>
+              </w:rPr>
+              <w:t>1. 단일 Offboard 비행</w:t>
+            </w:r>
+          </w:p>
+        </w:tc>
+        <w:tc>
+          <w:tcPr>
+            <w:tcW w:type="dxa" w:w="4320"/>
+          </w:tcPr>
+          <w:p>
+            <w:r/>
+            <w:r>
+              <w:rPr>
+                <w:sz w:val="18"/>
+              </w:rPr>
+              <w:t>drone_offboard, drone_bringup</w:t>
+            </w:r>
+          </w:p>
+        </w:tc>
+        <w:tc>
+          <w:tcPr>
+            <w:tcW w:type="dxa" w:w="2448"/>
+          </w:tcPr>
+          <w:p>
+            <w:r/>
+            <w:r>
+              <w:rPr>
+                <w:sz w:val="18"/>
+              </w:rPr>
+              <w:t>구현·단위테스트 / SITL 비행 검증 전</w:t>
+            </w:r>
+          </w:p>
+        </w:tc>
+      </w:tr>
+      <w:tr>
+        <w:tc>
+          <w:tcPr>
+            <w:tcW w:type="dxa" w:w="2592"/>
+          </w:tcPr>
+          <w:p>
+            <w:r/>
+            <w:r>
+              <w:rPr>
+                <w:sz w:val="18"/>
+              </w:rPr>
+              <w:t>2. GPS-denied 위치추정+회피</w:t>
+            </w:r>
+          </w:p>
+        </w:tc>
+        <w:tc>
+          <w:tcPr>
+            <w:tcW w:type="dxa" w:w="4320"/>
+          </w:tcPr>
+          <w:p>
+            <w:r/>
+            <w:r>
+              <w:rPr>
+                <w:sz w:val="18"/>
+              </w:rPr>
+              <w:t>drone_localization, drone_avoidance, drone_interfaces</w:t>
+            </w:r>
+          </w:p>
+        </w:tc>
+        <w:tc>
+          <w:tcPr>
+            <w:tcW w:type="dxa" w:w="2448"/>
+          </w:tcPr>
+          <w:p>
+            <w:r/>
+            <w:r>
+              <w:rPr>
+                <w:sz w:val="18"/>
+              </w:rPr>
+              <w:t>구현·단위테스트 / SITL 검증 전</w:t>
+            </w:r>
+          </w:p>
+        </w:tc>
+      </w:tr>
+      <w:tr>
+        <w:tc>
+          <w:tcPr>
+            <w:tcW w:type="dxa" w:w="2592"/>
+          </w:tcPr>
+          <w:p>
+            <w:r/>
+            <w:r>
+              <w:rPr>
+                <w:sz w:val="18"/>
+              </w:rPr>
+              <w:t>3. Jetson YOLO 인지</w:t>
+            </w:r>
+          </w:p>
+        </w:tc>
+        <w:tc>
+          <w:tcPr>
+            <w:tcW w:type="dxa" w:w="4320"/>
+          </w:tcPr>
+          <w:p>
+            <w:r/>
+            <w:r>
+              <w:rPr>
+                <w:sz w:val="18"/>
+              </w:rPr>
+              <w:t>drone_perception</w:t>
+            </w:r>
+          </w:p>
+        </w:tc>
+        <w:tc>
+          <w:tcPr>
+            <w:tcW w:type="dxa" w:w="2448"/>
+          </w:tcPr>
+          <w:p>
+            <w:r/>
+            <w:r>
+              <w:rPr>
+                <w:sz w:val="18"/>
+              </w:rPr>
+              <w:t>구현·단위테스트 / 추론노드·Jetson 검증 전</w:t>
+            </w:r>
+          </w:p>
+        </w:tc>
+      </w:tr>
+      <w:tr>
+        <w:tc>
+          <w:tcPr>
+            <w:tcW w:type="dxa" w:w="2592"/>
+          </w:tcPr>
+          <w:p>
+            <w:r/>
+            <w:r>
+              <w:rPr>
+                <w:sz w:val="18"/>
+              </w:rPr>
+              <w:t>4. 다중 드론 군집 좌표화</w:t>
+            </w:r>
+          </w:p>
+        </w:tc>
+        <w:tc>
+          <w:tcPr>
+            <w:tcW w:type="dxa" w:w="4320"/>
+          </w:tcPr>
+          <w:p>
+            <w:r/>
+            <w:r>
+              <w:rPr>
+                <w:sz w:val="18"/>
+              </w:rPr>
+              <w:t>swarm_coordination, swarm_agent</w:t>
+            </w:r>
+          </w:p>
+        </w:tc>
+        <w:tc>
+          <w:tcPr>
+            <w:tcW w:type="dxa" w:w="2448"/>
+          </w:tcPr>
+          <w:p>
+            <w:r/>
+            <w:r>
+              <w:rPr>
+                <w:sz w:val="18"/>
+              </w:rPr>
+              <w:t>구현 + 실런타임 검증 완료</w:t>
+            </w:r>
+          </w:p>
+        </w:tc>
+      </w:tr>
+      <w:tr>
+        <w:tc>
+          <w:tcPr>
+            <w:tcW w:type="dxa" w:w="2592"/>
+          </w:tcPr>
+          <w:p>
+            <w:r/>
+            <w:r>
+              <w:rPr>
+                <w:sz w:val="18"/>
+              </w:rPr>
+              <w:t>5. 보안 내성 레이어</w:t>
+            </w:r>
+          </w:p>
+        </w:tc>
+        <w:tc>
+          <w:tcPr>
+            <w:tcW w:type="dxa" w:w="4320"/>
+          </w:tcPr>
+          <w:p>
+            <w:r/>
+            <w:r>
+              <w:rPr>
+                <w:sz w:val="18"/>
+              </w:rPr>
+              <w:t>swarm_security, swarm_ids, swarm_consensus, swarm_attacker, swarm_viz</w:t>
+            </w:r>
+          </w:p>
+        </w:tc>
+        <w:tc>
+          <w:tcPr>
+            <w:tcW w:type="dxa" w:w="2448"/>
+          </w:tcPr>
+          <w:p>
+            <w:r/>
+            <w:r>
+              <w:rPr>
+                <w:sz w:val="18"/>
+              </w:rPr>
+              <w:t>구현 + 실런타임 검증 완료</w:t>
+            </w:r>
+          </w:p>
+        </w:tc>
+      </w:tr>
+    </w:tbl>
+    <w:p>
+      <w:pPr>
+        <w:spacing w:after="40"/>
+      </w:pPr>
+    </w:p>
+    <w:p>
+      <w:pPr>
+        <w:pStyle w:val="Heading2"/>
+      </w:pPr>
+      <w:r>
+        <w:t>11.1 실연동 검증 (ROS 2 Humble / Ubuntu 22.04)</w:t>
+      </w:r>
+    </w:p>
+    <w:tbl>
+      <w:tblPr>
+        <w:tblStyle w:val="LightGrid-Accent1"/>
+        <w:tblW w:type="auto" w:w="0"/>
+        <w:jc w:val="center"/>
+        <w:tblLook w:firstColumn="1" w:firstRow="1" w:lastColumn="0" w:lastRow="0" w:noHBand="0" w:noVBand="1" w:val="04A0"/>
+      </w:tblPr>
+      <w:tblGrid>
+        <w:gridCol w:w="4320"/>
+        <w:gridCol w:w="4320"/>
+      </w:tblGrid>
+      <w:tr>
+        <w:tc>
+          <w:tcPr>
+            <w:tcW w:type="dxa" w:w="3744"/>
+            <w:shd w:val="clear" w:color="auto" w:fill="1F4E79"/>
+          </w:tcPr>
+          <w:p>
+            <w:r/>
+            <w:r>
+              <w:rPr>
+                <w:b/>
+                <w:color w:val="FFFFFF"/>
+                <w:sz w:val="19"/>
+              </w:rPr>
+              <w:t>검증 항목</w:t>
+            </w:r>
+          </w:p>
+        </w:tc>
+        <w:tc>
+          <w:tcPr>
+            <w:tcW w:type="dxa" w:w="5616"/>
+            <w:shd w:val="clear" w:color="auto" w:fill="1F4E79"/>
+          </w:tcPr>
+          <w:p>
+            <w:r/>
+            <w:r>
+              <w:rPr>
+                <w:b/>
+                <w:color w:val="FFFFFF"/>
+                <w:sz w:val="19"/>
+              </w:rPr>
+              <w:t>결과</w:t>
+            </w:r>
+          </w:p>
+        </w:tc>
+      </w:tr>
+      <w:tr>
+        <w:tc>
+          <w:tcPr>
+            <w:tcW w:type="dxa" w:w="3744"/>
+          </w:tcPr>
+          <w:p>
+            <w:r/>
+            <w:r>
+              <w:rPr>
+                <w:sz w:val="19"/>
+              </w:rPr>
+              <w:t>colcon build (전체 25 패키지)</w:t>
+            </w:r>
+          </w:p>
+        </w:tc>
+        <w:tc>
+          <w:tcPr>
+            <w:tcW w:type="dxa" w:w="5616"/>
+          </w:tcPr>
+          <w:p>
+            <w:r/>
+            <w:r>
+              <w:rPr>
+                <w:sz w:val="19"/>
+              </w:rPr>
+              <w:t>25/25 성공 (메시지 생성 cmake 3개 포함)</w:t>
+            </w:r>
+          </w:p>
+        </w:tc>
+      </w:tr>
+      <w:tr>
+        <w:tc>
+          <w:tcPr>
+            <w:tcW w:type="dxa" w:w="3744"/>
+          </w:tcPr>
+          <w:p>
+            <w:r/>
+            <w:r>
+              <w:rPr>
+                <w:sz w:val="19"/>
+              </w:rPr>
+              <w:t>colcon test (알고리즘 6 패키지)</w:t>
+            </w:r>
+          </w:p>
+        </w:tc>
+        <w:tc>
+          <w:tcPr>
+            <w:tcW w:type="dxa" w:w="5616"/>
+          </w:tcPr>
+          <w:p>
+            <w:r/>
+            <w:r>
+              <w:rPr>
+                <w:sz w:val="19"/>
+              </w:rPr>
+              <w:t>53 tests, 0 failures</w:t>
+            </w:r>
+          </w:p>
+        </w:tc>
+      </w:tr>
+      <w:tr>
+        <w:tc>
+          <w:tcPr>
+            <w:tcW w:type="dxa" w:w="3744"/>
+          </w:tcPr>
+          <w:p>
+            <w:r/>
+            <w:r>
+              <w:rPr>
+                <w:sz w:val="19"/>
+              </w:rPr>
+              <w:t>Phase 4 런타임 (4-drone)</w:t>
+            </w:r>
+          </w:p>
+        </w:tc>
+        <w:tc>
+          <w:tcPr>
+            <w:tcW w:type="dxa" w:w="5616"/>
+          </w:tcPr>
+          <w:p>
+            <w:r/>
+            <w:r>
+              <w:rPr>
+                <w:sz w:val="19"/>
+              </w:rPr>
+              <w:t>4드론+consensus 정상, pose 40Hz, 전원 trusted</w:t>
+            </w:r>
+          </w:p>
+        </w:tc>
+      </w:tr>
+      <w:tr>
+        <w:tc>
+          <w:tcPr>
+            <w:tcW w:type="dxa" w:w="3744"/>
+          </w:tcPr>
+          <w:p>
+            <w:r/>
+            <w:r>
+              <w:rPr>
+                <w:sz w:val="19"/>
+              </w:rPr>
+              <w:t>Phase 5 런타임 (insider_teleport)</w:t>
+            </w:r>
+          </w:p>
+        </w:tc>
+        <w:tc>
+          <w:tcPr>
+            <w:tcW w:type="dxa" w:w="5616"/>
+          </w:tcPr>
+          <w:p>
+            <w:r/>
+            <w:r>
+              <w:rPr>
+                <w:sz w:val="19"/>
+              </w:rPr>
+              <w:t>drone_3 TELEPORT 탐지 → 격리, trusted=[drone_1, drone_2]</w:t>
+            </w:r>
+          </w:p>
+        </w:tc>
+      </w:tr>
+    </w:tbl>
+    <w:p>
+      <w:pPr>
+        <w:spacing w:after="40"/>
+      </w:pPr>
+    </w:p>
+    <w:p>
+      <w:pPr>
+        <w:spacing w:after="120" w:before="0"/>
+      </w:pPr>
+      <w:r>
+        <w:rPr>
+          <w:b w:val="0"/>
+          <w:i w:val="0"/>
+          <w:sz w:val="21"/>
+        </w:rPr>
+        <w:t>핵심 검증 포인트: 그룹키를 가진 내부자(drone_3)는 MAC 인증을 통과하지만, IDS의 물리 타당성(TELEPORT) 검사에 걸려 탐지되고, Byzantine 합의 가드가 정족수·지속증거 충족 시 격리한다. 정직한 드론에는 오탐이 발생하지 않았고, 격리 후 신뢰 집합이 자동 재구성되어 영역이 재분할되었다 — 차량 SecOC/IDS 개념이 드론 군집 통신에서 실제로 동작함을 코드와 런타임으로 입증.</w:t>
+      </w:r>
+    </w:p>
+    <w:p>
+      <w:pPr>
+        <w:pStyle w:val="Heading2"/>
+      </w:pPr>
+      <w:r>
+        <w:t>11.2 코드 가용성</w:t>
+      </w:r>
+    </w:p>
+    <w:p>
+      <w:pPr>
+        <w:spacing w:after="120" w:before="0"/>
+      </w:pPr>
+      <w:r>
+        <w:rPr>
+          <w:b w:val="0"/>
+          <w:i w:val="0"/>
+          <w:sz w:val="21"/>
+        </w:rPr>
+        <w:t>전체 소스: github.com/naimkim/sdv_platform_drone (ROS 2 Humble, Apache-2.0)</w:t>
+      </w:r>
+    </w:p>
+    <w:p>
+      <w:pPr>
+        <w:spacing w:after="120" w:before="0"/>
+      </w:pPr>
+      <w:r>
+        <w:rPr>
+          <w:b w:val="0"/>
+          <w:i w:val="0"/>
+          <w:color w:val="595959"/>
+          <w:sz w:val="19"/>
+        </w:rPr>
+        <w:t>알고리즘 코어(PID, SecOC MAC, Kalman 융합, GPS 무결성 모니터, 포텐셜 필드, 군집 분배/커버리지/충돌)는 ROS 비의존 순수 함수로 분리해 단위 테스트로 검증했다.</w:t>
+      </w:r>
+    </w:p>
     <w:sectPr>
       <w:pgSz w:w="12240" w:h="15840"/>
       <w:pgMar w:top="1440" w:right="1800" w:bottom="1440" w:left="1800" w:header="720" w:footer="720" w:gutter="0"/>

</xml_diff>